<commit_message>
Add submission details and fix a figure the prose had outgrown
The report front matter now carries name, email, repository and the Loom
walkthrough link.

Figure 3 was still titled "flat for 60 days" with a "day of quarter" axis,
because the earlier off-by-one fix corrected the prose and the slide deck but
not eda.py, which generates the figure the report embeds. So the text said
"one month into Q4" directly above a chart that said otherwise. The figure now
reads "flat for two months, then ramps through the final one" on a "days into
the quarter" axis, which is what a 0-origin axis actually measures.

Co-Authored-By: Claude Opus 5 (1M context) <noreply@anthropic.com>
</commit_message>
<xml_diff>
--- a/report/Freight_Rate_Report.docx
+++ b/report/Freight_Rate_Report.docx
@@ -14,12 +14,73 @@
       </w:r>
     </w:p>
     <w:p>
+      <w:pPr>
+        <w:spacing w:after="200"/>
+      </w:pPr>
       <w:r>
         <w:rPr>
           <w:i/>
           <w:color w:val="455A60"/>
         </w:rPr>
         <w:t>Spotter Machine Learning Engineer assessment</w:t>
+      </w:r>
+    </w:p>
+    <w:p>
+      <w:pPr>
+        <w:spacing w:after="60"/>
+      </w:pPr>
+      <w:r>
+        <w:rPr>
+          <w:b/>
+          <w:color w:val="1B1B1B"/>
+          <w:sz w:val="23"/>
+        </w:rPr>
+        <w:t>Muhaiminul Islam Ninad</w:t>
+      </w:r>
+      <w:r>
+        <w:rPr>
+          <w:color w:val="455A60"/>
+          <w:sz w:val="20"/>
+        </w:rPr>
+        <w:t xml:space="preserve">   ninadgns@gmail.com</w:t>
+      </w:r>
+    </w:p>
+    <w:p>
+      <w:pPr>
+        <w:spacing w:after="20"/>
+      </w:pPr>
+      <w:r>
+        <w:rPr>
+          <w:color w:val="455A60"/>
+          <w:sz w:val="20"/>
+        </w:rPr>
+        <w:t xml:space="preserve">Repository:  </w:t>
+      </w:r>
+      <w:r>
+        <w:rPr>
+          <w:color w:val="064A56"/>
+          <w:sz w:val="20"/>
+        </w:rPr>
+        <w:t>https://github.com/ninadgns/freight-rate-prediction</w:t>
+      </w:r>
+    </w:p>
+    <w:p>
+      <w:pPr>
+        <w:spacing w:after="20"/>
+      </w:pPr>
+      <w:r>
+        <w:rPr>
+          <w:color w:val="455A60"/>
+          <w:sz w:val="20"/>
+        </w:rPr>
+        <w:t xml:space="preserve">Walkthrough:  </w:t>
+      </w:r>
+      <w:r>
+        <w:rPr>
+          <w:color w:val="064A56"/>
+          <w:sz w:val="20"/>
+        </w:rPr>
+        <w:t>https://www.loom.com/share/e8ee8f8b14d24f43b23024d2ccd538ba</w:t>
       </w:r>
     </w:p>
     <w:p>

</xml_diff>

<commit_message>
Make the report links clickable and tidy the tables
python-docx has no hyperlink API, so the w:hyperlink elements are built by
hand and LibreOffice carries them through as real link annotations: three live
links on page 1 for email, repository and the video. Underline is suppressed
since the teal already marks them, and an underlined URL in a printed report
reads as clutter.

Table cell text is vertically centred with a little padding, so single-line
cells no longer sit against the top rule beside taller wrapped ones.

Co-Authored-By: Claude Opus 5 (1M context) <noreply@anthropic.com>
</commit_message>
<xml_diff>
--- a/report/Freight_Rate_Report.docx
+++ b/report/Freight_Rate_Report.docx
@@ -39,11 +39,20 @@
       </w:r>
       <w:r>
         <w:rPr>
-          <w:color w:val="455A60"/>
           <w:sz w:val="20"/>
         </w:rPr>
-        <w:t xml:space="preserve">   ninadgns@gmail.com</w:t>
+        <w:t xml:space="preserve">   </w:t>
       </w:r>
+      <w:hyperlink r:id="rId9">
+        <w:r>
+          <w:rPr>
+            <w:color w:val="455A60"/>
+            <w:sz w:val="20"/>
+            <w:u w:val="none"/>
+          </w:rPr>
+          <w:t xml:space="preserve">ninadgns@gmail.com</w:t>
+        </w:r>
+      </w:hyperlink>
     </w:p>
     <w:p>
       <w:pPr>
@@ -56,13 +65,16 @@
         </w:rPr>
         <w:t xml:space="preserve">Repository:  </w:t>
       </w:r>
-      <w:r>
-        <w:rPr>
-          <w:color w:val="064A56"/>
-          <w:sz w:val="20"/>
-        </w:rPr>
-        <w:t>https://github.com/ninadgns/freight-rate-prediction</w:t>
-      </w:r>
+      <w:hyperlink r:id="rId10">
+        <w:r>
+          <w:rPr>
+            <w:color w:val="064A56"/>
+            <w:sz w:val="20"/>
+            <w:u w:val="none"/>
+          </w:rPr>
+          <w:t xml:space="preserve">github.com/ninadgns/freight-rate-prediction</w:t>
+        </w:r>
+      </w:hyperlink>
     </w:p>
     <w:p>
       <w:pPr>
@@ -75,13 +87,16 @@
         </w:rPr>
         <w:t xml:space="preserve">Video overview (3 min):  </w:t>
       </w:r>
-      <w:r>
-        <w:rPr>
-          <w:color w:val="064A56"/>
-          <w:sz w:val="20"/>
-        </w:rPr>
-        <w:t>https://www.loom.com/share/e8ee8f8b14d24f43b23024d2ccd538ba</w:t>
-      </w:r>
+      <w:hyperlink r:id="rId11">
+        <w:r>
+          <w:rPr>
+            <w:color w:val="064A56"/>
+            <w:sz w:val="20"/>
+            <w:u w:val="none"/>
+          </w:rPr>
+          <w:t xml:space="preserve">loom.com/share/e8ee8f8b14d24f43b23024d2ccd538ba</w:t>
+        </w:r>
+      </w:hyperlink>
     </w:p>
     <w:p>
       <w:pPr>
@@ -204,7 +219,7 @@
                     <pic:cNvPicPr/>
                   </pic:nvPicPr>
                   <pic:blipFill>
-                    <a:blip r:embed="rId9"/>
+                    <a:blip r:embed="rId12"/>
                     <a:stretch>
                       <a:fillRect/>
                     </a:stretch>
@@ -271,10 +286,12 @@
         <w:tc>
           <w:tcPr>
             <w:tcW w:type="dxa" w:w="3744"/>
+            <w:vAlign w:val="center"/>
           </w:tcPr>
           <w:p>
             <w:pPr>
               <w:keepNext/>
+              <w:spacing w:before="60" w:after="60"/>
             </w:pPr>
             <w:r/>
             <w:r>
@@ -289,10 +306,12 @@
         <w:tc>
           <w:tcPr>
             <w:tcW w:type="dxa" w:w="3456"/>
+            <w:vAlign w:val="center"/>
           </w:tcPr>
           <w:p>
             <w:pPr>
               <w:keepNext/>
+              <w:spacing w:before="60" w:after="60"/>
             </w:pPr>
             <w:r/>
             <w:r>
@@ -307,10 +326,12 @@
         <w:tc>
           <w:tcPr>
             <w:tcW w:type="dxa" w:w="2736"/>
+            <w:vAlign w:val="center"/>
           </w:tcPr>
           <w:p>
             <w:pPr>
               <w:keepNext/>
+              <w:spacing w:before="60" w:after="60"/>
             </w:pPr>
             <w:r/>
             <w:r>
@@ -330,10 +351,12 @@
         <w:tc>
           <w:tcPr>
             <w:tcW w:type="dxa" w:w="3744"/>
+            <w:vAlign w:val="center"/>
           </w:tcPr>
           <w:p>
             <w:pPr>
               <w:keepNext/>
+              <w:spacing w:before="60" w:after="60"/>
             </w:pPr>
             <w:r/>
             <w:r>
@@ -347,10 +370,12 @@
         <w:tc>
           <w:tcPr>
             <w:tcW w:type="dxa" w:w="3456"/>
+            <w:vAlign w:val="center"/>
           </w:tcPr>
           <w:p>
             <w:pPr>
               <w:keepNext/>
+              <w:spacing w:before="60" w:after="60"/>
             </w:pPr>
             <w:r/>
             <w:r>
@@ -364,10 +389,12 @@
         <w:tc>
           <w:tcPr>
             <w:tcW w:type="dxa" w:w="2736"/>
+            <w:vAlign w:val="center"/>
           </w:tcPr>
           <w:p>
             <w:pPr>
               <w:keepNext/>
+              <w:spacing w:before="60" w:after="60"/>
             </w:pPr>
             <w:r/>
             <w:r>
@@ -386,8 +413,12 @@
         <w:tc>
           <w:tcPr>
             <w:tcW w:type="dxa" w:w="3744"/>
+            <w:vAlign w:val="center"/>
           </w:tcPr>
           <w:p>
+            <w:pPr>
+              <w:spacing w:before="60" w:after="60"/>
+            </w:pPr>
             <w:r/>
             <w:r>
               <w:rPr>
@@ -400,8 +431,12 @@
         <w:tc>
           <w:tcPr>
             <w:tcW w:type="dxa" w:w="3456"/>
+            <w:vAlign w:val="center"/>
           </w:tcPr>
           <w:p>
+            <w:pPr>
+              <w:spacing w:before="60" w:after="60"/>
+            </w:pPr>
             <w:r/>
             <w:r>
               <w:rPr>
@@ -414,8 +449,12 @@
         <w:tc>
           <w:tcPr>
             <w:tcW w:type="dxa" w:w="2736"/>
+            <w:vAlign w:val="center"/>
           </w:tcPr>
           <w:p>
+            <w:pPr>
+              <w:spacing w:before="60" w:after="60"/>
+            </w:pPr>
             <w:r/>
             <w:r>
               <w:rPr>
@@ -467,10 +506,12 @@
         <w:tc>
           <w:tcPr>
             <w:tcW w:type="dxa" w:w="2880"/>
+            <w:vAlign w:val="center"/>
           </w:tcPr>
           <w:p>
             <w:pPr>
               <w:keepNext/>
+              <w:spacing w:before="60" w:after="60"/>
             </w:pPr>
             <w:r/>
             <w:r>
@@ -485,10 +526,12 @@
         <w:tc>
           <w:tcPr>
             <w:tcW w:type="dxa" w:w="3456"/>
+            <w:vAlign w:val="center"/>
           </w:tcPr>
           <w:p>
             <w:pPr>
               <w:keepNext/>
+              <w:spacing w:before="60" w:after="60"/>
             </w:pPr>
             <w:r/>
             <w:r>
@@ -503,10 +546,12 @@
         <w:tc>
           <w:tcPr>
             <w:tcW w:type="dxa" w:w="3600"/>
+            <w:vAlign w:val="center"/>
           </w:tcPr>
           <w:p>
             <w:pPr>
               <w:keepNext/>
+              <w:spacing w:before="60" w:after="60"/>
             </w:pPr>
             <w:r/>
             <w:r>
@@ -526,10 +571,12 @@
         <w:tc>
           <w:tcPr>
             <w:tcW w:type="dxa" w:w="2880"/>
+            <w:vAlign w:val="center"/>
           </w:tcPr>
           <w:p>
             <w:pPr>
               <w:keepNext/>
+              <w:spacing w:before="60" w:after="60"/>
             </w:pPr>
             <w:r/>
             <w:r>
@@ -543,10 +590,12 @@
         <w:tc>
           <w:tcPr>
             <w:tcW w:type="dxa" w:w="3456"/>
+            <w:vAlign w:val="center"/>
           </w:tcPr>
           <w:p>
             <w:pPr>
               <w:keepNext/>
+              <w:spacing w:before="60" w:after="60"/>
             </w:pPr>
             <w:r/>
             <w:r>
@@ -560,10 +609,12 @@
         <w:tc>
           <w:tcPr>
             <w:tcW w:type="dxa" w:w="3600"/>
+            <w:vAlign w:val="center"/>
           </w:tcPr>
           <w:p>
             <w:pPr>
               <w:keepNext/>
+              <w:spacing w:before="60" w:after="60"/>
             </w:pPr>
             <w:r/>
             <w:r>
@@ -582,10 +633,12 @@
         <w:tc>
           <w:tcPr>
             <w:tcW w:type="dxa" w:w="2880"/>
+            <w:vAlign w:val="center"/>
           </w:tcPr>
           <w:p>
             <w:pPr>
               <w:keepNext/>
+              <w:spacing w:before="60" w:after="60"/>
             </w:pPr>
             <w:r/>
             <w:r>
@@ -599,10 +652,12 @@
         <w:tc>
           <w:tcPr>
             <w:tcW w:type="dxa" w:w="3456"/>
+            <w:vAlign w:val="center"/>
           </w:tcPr>
           <w:p>
             <w:pPr>
               <w:keepNext/>
+              <w:spacing w:before="60" w:after="60"/>
             </w:pPr>
             <w:r/>
             <w:r>
@@ -616,10 +671,12 @@
         <w:tc>
           <w:tcPr>
             <w:tcW w:type="dxa" w:w="3600"/>
+            <w:vAlign w:val="center"/>
           </w:tcPr>
           <w:p>
             <w:pPr>
               <w:keepNext/>
+              <w:spacing w:before="60" w:after="60"/>
             </w:pPr>
             <w:r/>
             <w:r>
@@ -638,10 +695,12 @@
         <w:tc>
           <w:tcPr>
             <w:tcW w:type="dxa" w:w="2880"/>
+            <w:vAlign w:val="center"/>
           </w:tcPr>
           <w:p>
             <w:pPr>
               <w:keepNext/>
+              <w:spacing w:before="60" w:after="60"/>
             </w:pPr>
             <w:r/>
             <w:r>
@@ -655,10 +714,12 @@
         <w:tc>
           <w:tcPr>
             <w:tcW w:type="dxa" w:w="3456"/>
+            <w:vAlign w:val="center"/>
           </w:tcPr>
           <w:p>
             <w:pPr>
               <w:keepNext/>
+              <w:spacing w:before="60" w:after="60"/>
             </w:pPr>
             <w:r/>
             <w:r>
@@ -672,10 +733,12 @@
         <w:tc>
           <w:tcPr>
             <w:tcW w:type="dxa" w:w="3600"/>
+            <w:vAlign w:val="center"/>
           </w:tcPr>
           <w:p>
             <w:pPr>
               <w:keepNext/>
+              <w:spacing w:before="60" w:after="60"/>
             </w:pPr>
             <w:r/>
             <w:r>
@@ -694,10 +757,12 @@
         <w:tc>
           <w:tcPr>
             <w:tcW w:type="dxa" w:w="2880"/>
+            <w:vAlign w:val="center"/>
           </w:tcPr>
           <w:p>
             <w:pPr>
               <w:keepNext/>
+              <w:spacing w:before="60" w:after="60"/>
             </w:pPr>
             <w:r/>
             <w:r>
@@ -711,10 +776,12 @@
         <w:tc>
           <w:tcPr>
             <w:tcW w:type="dxa" w:w="3456"/>
+            <w:vAlign w:val="center"/>
           </w:tcPr>
           <w:p>
             <w:pPr>
               <w:keepNext/>
+              <w:spacing w:before="60" w:after="60"/>
             </w:pPr>
             <w:r/>
             <w:r>
@@ -728,10 +795,12 @@
         <w:tc>
           <w:tcPr>
             <w:tcW w:type="dxa" w:w="3600"/>
+            <w:vAlign w:val="center"/>
           </w:tcPr>
           <w:p>
             <w:pPr>
               <w:keepNext/>
+              <w:spacing w:before="60" w:after="60"/>
             </w:pPr>
             <w:r/>
             <w:r>
@@ -750,8 +819,12 @@
         <w:tc>
           <w:tcPr>
             <w:tcW w:type="dxa" w:w="2880"/>
+            <w:vAlign w:val="center"/>
           </w:tcPr>
           <w:p>
+            <w:pPr>
+              <w:spacing w:before="60" w:after="60"/>
+            </w:pPr>
             <w:r/>
             <w:r>
               <w:rPr>
@@ -764,8 +837,12 @@
         <w:tc>
           <w:tcPr>
             <w:tcW w:type="dxa" w:w="3456"/>
+            <w:vAlign w:val="center"/>
           </w:tcPr>
           <w:p>
+            <w:pPr>
+              <w:spacing w:before="60" w:after="60"/>
+            </w:pPr>
             <w:r/>
             <w:r>
               <w:rPr>
@@ -778,8 +855,12 @@
         <w:tc>
           <w:tcPr>
             <w:tcW w:type="dxa" w:w="3600"/>
+            <w:vAlign w:val="center"/>
           </w:tcPr>
           <w:p>
+            <w:pPr>
+              <w:spacing w:before="60" w:after="60"/>
+            </w:pPr>
             <w:r/>
             <w:r>
               <w:rPr>
@@ -825,7 +906,7 @@
                     <pic:cNvPicPr/>
                   </pic:nvPicPr>
                   <pic:blipFill>
-                    <a:blip r:embed="rId10"/>
+                    <a:blip r:embed="rId13"/>
                     <a:stretch>
                       <a:fillRect/>
                     </a:stretch>
@@ -892,10 +973,12 @@
         <w:tc>
           <w:tcPr>
             <w:tcW w:type="dxa" w:w="3744"/>
+            <w:vAlign w:val="center"/>
           </w:tcPr>
           <w:p>
             <w:pPr>
               <w:keepNext/>
+              <w:spacing w:before="60" w:after="60"/>
             </w:pPr>
             <w:r/>
             <w:r>
@@ -909,10 +992,12 @@
         <w:tc>
           <w:tcPr>
             <w:tcW w:type="dxa" w:w="3024"/>
+            <w:vAlign w:val="center"/>
           </w:tcPr>
           <w:p>
             <w:pPr>
               <w:keepNext/>
+              <w:spacing w:before="60" w:after="60"/>
             </w:pPr>
             <w:r/>
             <w:r>
@@ -927,10 +1012,12 @@
         <w:tc>
           <w:tcPr>
             <w:tcW w:type="dxa" w:w="3024"/>
+            <w:vAlign w:val="center"/>
           </w:tcPr>
           <w:p>
             <w:pPr>
               <w:keepNext/>
+              <w:spacing w:before="60" w:after="60"/>
             </w:pPr>
             <w:r/>
             <w:r>
@@ -950,10 +1037,12 @@
         <w:tc>
           <w:tcPr>
             <w:tcW w:type="dxa" w:w="3744"/>
+            <w:vAlign w:val="center"/>
           </w:tcPr>
           <w:p>
             <w:pPr>
               <w:keepNext/>
+              <w:spacing w:before="60" w:after="60"/>
             </w:pPr>
             <w:r/>
             <w:r>
@@ -967,10 +1056,12 @@
         <w:tc>
           <w:tcPr>
             <w:tcW w:type="dxa" w:w="3024"/>
+            <w:vAlign w:val="center"/>
           </w:tcPr>
           <w:p>
             <w:pPr>
               <w:keepNext/>
+              <w:spacing w:before="60" w:after="60"/>
             </w:pPr>
             <w:r/>
             <w:r>
@@ -984,10 +1075,12 @@
         <w:tc>
           <w:tcPr>
             <w:tcW w:type="dxa" w:w="3024"/>
+            <w:vAlign w:val="center"/>
           </w:tcPr>
           <w:p>
             <w:pPr>
               <w:keepNext/>
+              <w:spacing w:before="60" w:after="60"/>
             </w:pPr>
             <w:r/>
             <w:r>
@@ -1006,10 +1099,12 @@
         <w:tc>
           <w:tcPr>
             <w:tcW w:type="dxa" w:w="3744"/>
+            <w:vAlign w:val="center"/>
           </w:tcPr>
           <w:p>
             <w:pPr>
               <w:keepNext/>
+              <w:spacing w:before="60" w:after="60"/>
             </w:pPr>
             <w:r/>
             <w:r>
@@ -1023,10 +1118,12 @@
         <w:tc>
           <w:tcPr>
             <w:tcW w:type="dxa" w:w="3024"/>
+            <w:vAlign w:val="center"/>
           </w:tcPr>
           <w:p>
             <w:pPr>
               <w:keepNext/>
+              <w:spacing w:before="60" w:after="60"/>
             </w:pPr>
             <w:r/>
             <w:r>
@@ -1040,10 +1137,12 @@
         <w:tc>
           <w:tcPr>
             <w:tcW w:type="dxa" w:w="3024"/>
+            <w:vAlign w:val="center"/>
           </w:tcPr>
           <w:p>
             <w:pPr>
               <w:keepNext/>
+              <w:spacing w:before="60" w:after="60"/>
             </w:pPr>
             <w:r/>
             <w:r>
@@ -1062,8 +1161,12 @@
         <w:tc>
           <w:tcPr>
             <w:tcW w:type="dxa" w:w="3744"/>
+            <w:vAlign w:val="center"/>
           </w:tcPr>
           <w:p>
+            <w:pPr>
+              <w:spacing w:before="60" w:after="60"/>
+            </w:pPr>
             <w:r/>
             <w:r>
               <w:rPr>
@@ -1076,8 +1179,12 @@
         <w:tc>
           <w:tcPr>
             <w:tcW w:type="dxa" w:w="3024"/>
+            <w:vAlign w:val="center"/>
           </w:tcPr>
           <w:p>
+            <w:pPr>
+              <w:spacing w:before="60" w:after="60"/>
+            </w:pPr>
             <w:r/>
             <w:r>
               <w:rPr>
@@ -1090,8 +1197,12 @@
         <w:tc>
           <w:tcPr>
             <w:tcW w:type="dxa" w:w="3024"/>
+            <w:vAlign w:val="center"/>
           </w:tcPr>
           <w:p>
+            <w:pPr>
+              <w:spacing w:before="60" w:after="60"/>
+            </w:pPr>
             <w:r/>
             <w:r>
               <w:rPr>
@@ -1145,7 +1256,7 @@
                     <pic:cNvPicPr/>
                   </pic:nvPicPr>
                   <pic:blipFill>
-                    <a:blip r:embed="rId11"/>
+                    <a:blip r:embed="rId14"/>
                     <a:stretch>
                       <a:fillRect/>
                     </a:stretch>
@@ -1213,10 +1324,12 @@
         <w:tc>
           <w:tcPr>
             <w:tcW w:type="dxa" w:w="2016"/>
+            <w:vAlign w:val="center"/>
           </w:tcPr>
           <w:p>
             <w:pPr>
               <w:keepNext/>
+              <w:spacing w:before="60" w:after="60"/>
             </w:pPr>
             <w:r/>
             <w:r>
@@ -1231,10 +1344,12 @@
         <w:tc>
           <w:tcPr>
             <w:tcW w:type="dxa" w:w="2592"/>
+            <w:vAlign w:val="center"/>
           </w:tcPr>
           <w:p>
             <w:pPr>
               <w:keepNext/>
+              <w:spacing w:before="60" w:after="60"/>
             </w:pPr>
             <w:r/>
             <w:r>
@@ -1249,10 +1364,12 @@
         <w:tc>
           <w:tcPr>
             <w:tcW w:type="dxa" w:w="2592"/>
+            <w:vAlign w:val="center"/>
           </w:tcPr>
           <w:p>
             <w:pPr>
               <w:keepNext/>
+              <w:spacing w:before="60" w:after="60"/>
             </w:pPr>
             <w:r/>
             <w:r>
@@ -1267,10 +1384,12 @@
         <w:tc>
           <w:tcPr>
             <w:tcW w:type="dxa" w:w="2880"/>
+            <w:vAlign w:val="center"/>
           </w:tcPr>
           <w:p>
             <w:pPr>
               <w:keepNext/>
+              <w:spacing w:before="60" w:after="60"/>
             </w:pPr>
             <w:r/>
             <w:r>
@@ -1290,10 +1409,12 @@
         <w:tc>
           <w:tcPr>
             <w:tcW w:type="dxa" w:w="2016"/>
+            <w:vAlign w:val="center"/>
           </w:tcPr>
           <w:p>
             <w:pPr>
               <w:keepNext/>
+              <w:spacing w:before="60" w:after="60"/>
             </w:pPr>
             <w:r/>
             <w:r>
@@ -1307,10 +1428,12 @@
         <w:tc>
           <w:tcPr>
             <w:tcW w:type="dxa" w:w="2592"/>
+            <w:vAlign w:val="center"/>
           </w:tcPr>
           <w:p>
             <w:pPr>
               <w:keepNext/>
+              <w:spacing w:before="60" w:after="60"/>
             </w:pPr>
             <w:r/>
             <w:r>
@@ -1324,10 +1447,12 @@
         <w:tc>
           <w:tcPr>
             <w:tcW w:type="dxa" w:w="2592"/>
+            <w:vAlign w:val="center"/>
           </w:tcPr>
           <w:p>
             <w:pPr>
               <w:keepNext/>
+              <w:spacing w:before="60" w:after="60"/>
             </w:pPr>
             <w:r/>
             <w:r>
@@ -1341,10 +1466,12 @@
         <w:tc>
           <w:tcPr>
             <w:tcW w:type="dxa" w:w="2880"/>
+            <w:vAlign w:val="center"/>
           </w:tcPr>
           <w:p>
             <w:pPr>
               <w:keepNext/>
+              <w:spacing w:before="60" w:after="60"/>
             </w:pPr>
             <w:r/>
             <w:r>
@@ -1363,10 +1490,12 @@
         <w:tc>
           <w:tcPr>
             <w:tcW w:type="dxa" w:w="2016"/>
+            <w:vAlign w:val="center"/>
           </w:tcPr>
           <w:p>
             <w:pPr>
               <w:keepNext/>
+              <w:spacing w:before="60" w:after="60"/>
             </w:pPr>
             <w:r/>
             <w:r>
@@ -1380,10 +1509,12 @@
         <w:tc>
           <w:tcPr>
             <w:tcW w:type="dxa" w:w="2592"/>
+            <w:vAlign w:val="center"/>
           </w:tcPr>
           <w:p>
             <w:pPr>
               <w:keepNext/>
+              <w:spacing w:before="60" w:after="60"/>
             </w:pPr>
             <w:r/>
             <w:r>
@@ -1397,10 +1528,12 @@
         <w:tc>
           <w:tcPr>
             <w:tcW w:type="dxa" w:w="2592"/>
+            <w:vAlign w:val="center"/>
           </w:tcPr>
           <w:p>
             <w:pPr>
               <w:keepNext/>
+              <w:spacing w:before="60" w:after="60"/>
             </w:pPr>
             <w:r/>
             <w:r>
@@ -1414,10 +1547,12 @@
         <w:tc>
           <w:tcPr>
             <w:tcW w:type="dxa" w:w="2880"/>
+            <w:vAlign w:val="center"/>
           </w:tcPr>
           <w:p>
             <w:pPr>
               <w:keepNext/>
+              <w:spacing w:before="60" w:after="60"/>
             </w:pPr>
             <w:r/>
             <w:r>
@@ -1436,8 +1571,12 @@
         <w:tc>
           <w:tcPr>
             <w:tcW w:type="dxa" w:w="2016"/>
+            <w:vAlign w:val="center"/>
           </w:tcPr>
           <w:p>
+            <w:pPr>
+              <w:spacing w:before="60" w:after="60"/>
+            </w:pPr>
             <w:r/>
             <w:r>
               <w:rPr>
@@ -1450,8 +1589,12 @@
         <w:tc>
           <w:tcPr>
             <w:tcW w:type="dxa" w:w="2592"/>
+            <w:vAlign w:val="center"/>
           </w:tcPr>
           <w:p>
+            <w:pPr>
+              <w:spacing w:before="60" w:after="60"/>
+            </w:pPr>
             <w:r/>
             <w:r>
               <w:rPr>
@@ -1464,8 +1607,12 @@
         <w:tc>
           <w:tcPr>
             <w:tcW w:type="dxa" w:w="2592"/>
+            <w:vAlign w:val="center"/>
           </w:tcPr>
           <w:p>
+            <w:pPr>
+              <w:spacing w:before="60" w:after="60"/>
+            </w:pPr>
             <w:r/>
             <w:r>
               <w:rPr>
@@ -1478,8 +1625,12 @@
         <w:tc>
           <w:tcPr>
             <w:tcW w:type="dxa" w:w="2880"/>
+            <w:vAlign w:val="center"/>
           </w:tcPr>
           <w:p>
+            <w:pPr>
+              <w:spacing w:before="60" w:after="60"/>
+            </w:pPr>
             <w:r/>
             <w:r>
               <w:rPr>
@@ -1610,7 +1761,7 @@
                     <pic:cNvPicPr/>
                   </pic:nvPicPr>
                   <pic:blipFill>
-                    <a:blip r:embed="rId12"/>
+                    <a:blip r:embed="rId15"/>
                     <a:stretch>
                       <a:fillRect/>
                     </a:stretch>
@@ -1787,10 +1938,12 @@
         <w:tc>
           <w:tcPr>
             <w:tcW w:type="dxa" w:w="2880"/>
+            <w:vAlign w:val="center"/>
           </w:tcPr>
           <w:p>
             <w:pPr>
               <w:keepNext/>
+              <w:spacing w:before="60" w:after="60"/>
             </w:pPr>
             <w:r/>
             <w:r>
@@ -1805,10 +1958,12 @@
         <w:tc>
           <w:tcPr>
             <w:tcW w:type="dxa" w:w="1584"/>
+            <w:vAlign w:val="center"/>
           </w:tcPr>
           <w:p>
             <w:pPr>
               <w:keepNext/>
+              <w:spacing w:before="60" w:after="60"/>
             </w:pPr>
             <w:r/>
             <w:r>
@@ -1823,10 +1978,12 @@
         <w:tc>
           <w:tcPr>
             <w:tcW w:type="dxa" w:w="1872"/>
+            <w:vAlign w:val="center"/>
           </w:tcPr>
           <w:p>
             <w:pPr>
               <w:keepNext/>
+              <w:spacing w:before="60" w:after="60"/>
             </w:pPr>
             <w:r/>
             <w:r>
@@ -1841,10 +1998,12 @@
         <w:tc>
           <w:tcPr>
             <w:tcW w:type="dxa" w:w="1872"/>
+            <w:vAlign w:val="center"/>
           </w:tcPr>
           <w:p>
             <w:pPr>
               <w:keepNext/>
+              <w:spacing w:before="60" w:after="60"/>
             </w:pPr>
             <w:r/>
             <w:r>
@@ -1859,10 +2018,12 @@
         <w:tc>
           <w:tcPr>
             <w:tcW w:type="dxa" w:w="1584"/>
+            <w:vAlign w:val="center"/>
           </w:tcPr>
           <w:p>
             <w:pPr>
               <w:keepNext/>
+              <w:spacing w:before="60" w:after="60"/>
             </w:pPr>
             <w:r/>
             <w:r>
@@ -1882,10 +2043,12 @@
         <w:tc>
           <w:tcPr>
             <w:tcW w:type="dxa" w:w="2880"/>
+            <w:vAlign w:val="center"/>
           </w:tcPr>
           <w:p>
             <w:pPr>
               <w:keepNext/>
+              <w:spacing w:before="60" w:after="60"/>
             </w:pPr>
             <w:r/>
             <w:r>
@@ -1899,10 +2062,12 @@
         <w:tc>
           <w:tcPr>
             <w:tcW w:type="dxa" w:w="1584"/>
+            <w:vAlign w:val="center"/>
           </w:tcPr>
           <w:p>
             <w:pPr>
               <w:keepNext/>
+              <w:spacing w:before="60" w:after="60"/>
             </w:pPr>
             <w:r/>
             <w:r>
@@ -1916,10 +2081,12 @@
         <w:tc>
           <w:tcPr>
             <w:tcW w:type="dxa" w:w="1872"/>
+            <w:vAlign w:val="center"/>
           </w:tcPr>
           <w:p>
             <w:pPr>
               <w:keepNext/>
+              <w:spacing w:before="60" w:after="60"/>
             </w:pPr>
             <w:r/>
             <w:r>
@@ -1933,10 +2100,12 @@
         <w:tc>
           <w:tcPr>
             <w:tcW w:type="dxa" w:w="1872"/>
+            <w:vAlign w:val="center"/>
           </w:tcPr>
           <w:p>
             <w:pPr>
               <w:keepNext/>
+              <w:spacing w:before="60" w:after="60"/>
             </w:pPr>
             <w:r/>
             <w:r>
@@ -1950,10 +2119,12 @@
         <w:tc>
           <w:tcPr>
             <w:tcW w:type="dxa" w:w="1584"/>
+            <w:vAlign w:val="center"/>
           </w:tcPr>
           <w:p>
             <w:pPr>
               <w:keepNext/>
+              <w:spacing w:before="60" w:after="60"/>
             </w:pPr>
             <w:r/>
             <w:r>
@@ -1972,10 +2143,12 @@
         <w:tc>
           <w:tcPr>
             <w:tcW w:type="dxa" w:w="2880"/>
+            <w:vAlign w:val="center"/>
           </w:tcPr>
           <w:p>
             <w:pPr>
               <w:keepNext/>
+              <w:spacing w:before="60" w:after="60"/>
             </w:pPr>
             <w:r/>
             <w:r>
@@ -1989,10 +2162,12 @@
         <w:tc>
           <w:tcPr>
             <w:tcW w:type="dxa" w:w="1584"/>
+            <w:vAlign w:val="center"/>
           </w:tcPr>
           <w:p>
             <w:pPr>
               <w:keepNext/>
+              <w:spacing w:before="60" w:after="60"/>
             </w:pPr>
             <w:r/>
             <w:r>
@@ -2006,10 +2181,12 @@
         <w:tc>
           <w:tcPr>
             <w:tcW w:type="dxa" w:w="1872"/>
+            <w:vAlign w:val="center"/>
           </w:tcPr>
           <w:p>
             <w:pPr>
               <w:keepNext/>
+              <w:spacing w:before="60" w:after="60"/>
             </w:pPr>
             <w:r/>
             <w:r>
@@ -2023,10 +2200,12 @@
         <w:tc>
           <w:tcPr>
             <w:tcW w:type="dxa" w:w="1872"/>
+            <w:vAlign w:val="center"/>
           </w:tcPr>
           <w:p>
             <w:pPr>
               <w:keepNext/>
+              <w:spacing w:before="60" w:after="60"/>
             </w:pPr>
             <w:r/>
             <w:r>
@@ -2040,10 +2219,12 @@
         <w:tc>
           <w:tcPr>
             <w:tcW w:type="dxa" w:w="1584"/>
+            <w:vAlign w:val="center"/>
           </w:tcPr>
           <w:p>
             <w:pPr>
               <w:keepNext/>
+              <w:spacing w:before="60" w:after="60"/>
             </w:pPr>
             <w:r/>
             <w:r>
@@ -2062,10 +2243,12 @@
         <w:tc>
           <w:tcPr>
             <w:tcW w:type="dxa" w:w="2880"/>
+            <w:vAlign w:val="center"/>
           </w:tcPr>
           <w:p>
             <w:pPr>
               <w:keepNext/>
+              <w:spacing w:before="60" w:after="60"/>
             </w:pPr>
             <w:r/>
             <w:r>
@@ -2079,10 +2262,12 @@
         <w:tc>
           <w:tcPr>
             <w:tcW w:type="dxa" w:w="1584"/>
+            <w:vAlign w:val="center"/>
           </w:tcPr>
           <w:p>
             <w:pPr>
               <w:keepNext/>
+              <w:spacing w:before="60" w:after="60"/>
             </w:pPr>
             <w:r/>
             <w:r>
@@ -2096,10 +2281,12 @@
         <w:tc>
           <w:tcPr>
             <w:tcW w:type="dxa" w:w="1872"/>
+            <w:vAlign w:val="center"/>
           </w:tcPr>
           <w:p>
             <w:pPr>
               <w:keepNext/>
+              <w:spacing w:before="60" w:after="60"/>
             </w:pPr>
             <w:r/>
             <w:r>
@@ -2113,10 +2300,12 @@
         <w:tc>
           <w:tcPr>
             <w:tcW w:type="dxa" w:w="1872"/>
+            <w:vAlign w:val="center"/>
           </w:tcPr>
           <w:p>
             <w:pPr>
               <w:keepNext/>
+              <w:spacing w:before="60" w:after="60"/>
             </w:pPr>
             <w:r/>
             <w:r>
@@ -2130,10 +2319,12 @@
         <w:tc>
           <w:tcPr>
             <w:tcW w:type="dxa" w:w="1584"/>
+            <w:vAlign w:val="center"/>
           </w:tcPr>
           <w:p>
             <w:pPr>
               <w:keepNext/>
+              <w:spacing w:before="60" w:after="60"/>
             </w:pPr>
             <w:r/>
             <w:r>
@@ -2152,10 +2343,12 @@
         <w:tc>
           <w:tcPr>
             <w:tcW w:type="dxa" w:w="2880"/>
+            <w:vAlign w:val="center"/>
           </w:tcPr>
           <w:p>
             <w:pPr>
               <w:keepNext/>
+              <w:spacing w:before="60" w:after="60"/>
             </w:pPr>
             <w:r/>
             <w:r>
@@ -2169,10 +2362,12 @@
         <w:tc>
           <w:tcPr>
             <w:tcW w:type="dxa" w:w="1584"/>
+            <w:vAlign w:val="center"/>
           </w:tcPr>
           <w:p>
             <w:pPr>
               <w:keepNext/>
+              <w:spacing w:before="60" w:after="60"/>
             </w:pPr>
             <w:r/>
             <w:r>
@@ -2186,10 +2381,12 @@
         <w:tc>
           <w:tcPr>
             <w:tcW w:type="dxa" w:w="1872"/>
+            <w:vAlign w:val="center"/>
           </w:tcPr>
           <w:p>
             <w:pPr>
               <w:keepNext/>
+              <w:spacing w:before="60" w:after="60"/>
             </w:pPr>
             <w:r/>
             <w:r>
@@ -2203,10 +2400,12 @@
         <w:tc>
           <w:tcPr>
             <w:tcW w:type="dxa" w:w="1872"/>
+            <w:vAlign w:val="center"/>
           </w:tcPr>
           <w:p>
             <w:pPr>
               <w:keepNext/>
+              <w:spacing w:before="60" w:after="60"/>
             </w:pPr>
             <w:r/>
             <w:r>
@@ -2220,10 +2419,12 @@
         <w:tc>
           <w:tcPr>
             <w:tcW w:type="dxa" w:w="1584"/>
+            <w:vAlign w:val="center"/>
           </w:tcPr>
           <w:p>
             <w:pPr>
               <w:keepNext/>
+              <w:spacing w:before="60" w:after="60"/>
             </w:pPr>
             <w:r/>
             <w:r>
@@ -2242,10 +2443,12 @@
         <w:tc>
           <w:tcPr>
             <w:tcW w:type="dxa" w:w="2880"/>
+            <w:vAlign w:val="center"/>
           </w:tcPr>
           <w:p>
             <w:pPr>
               <w:keepNext/>
+              <w:spacing w:before="60" w:after="60"/>
             </w:pPr>
             <w:r/>
             <w:r>
@@ -2259,10 +2462,12 @@
         <w:tc>
           <w:tcPr>
             <w:tcW w:type="dxa" w:w="1584"/>
+            <w:vAlign w:val="center"/>
           </w:tcPr>
           <w:p>
             <w:pPr>
               <w:keepNext/>
+              <w:spacing w:before="60" w:after="60"/>
             </w:pPr>
             <w:r/>
             <w:r>
@@ -2276,10 +2481,12 @@
         <w:tc>
           <w:tcPr>
             <w:tcW w:type="dxa" w:w="1872"/>
+            <w:vAlign w:val="center"/>
           </w:tcPr>
           <w:p>
             <w:pPr>
               <w:keepNext/>
+              <w:spacing w:before="60" w:after="60"/>
             </w:pPr>
             <w:r/>
             <w:r>
@@ -2293,10 +2500,12 @@
         <w:tc>
           <w:tcPr>
             <w:tcW w:type="dxa" w:w="1872"/>
+            <w:vAlign w:val="center"/>
           </w:tcPr>
           <w:p>
             <w:pPr>
               <w:keepNext/>
+              <w:spacing w:before="60" w:after="60"/>
             </w:pPr>
             <w:r/>
             <w:r>
@@ -2310,10 +2519,12 @@
         <w:tc>
           <w:tcPr>
             <w:tcW w:type="dxa" w:w="1584"/>
+            <w:vAlign w:val="center"/>
           </w:tcPr>
           <w:p>
             <w:pPr>
               <w:keepNext/>
+              <w:spacing w:before="60" w:after="60"/>
             </w:pPr>
             <w:r/>
             <w:r>
@@ -2332,8 +2543,12 @@
         <w:tc>
           <w:tcPr>
             <w:tcW w:type="dxa" w:w="2880"/>
+            <w:vAlign w:val="center"/>
           </w:tcPr>
           <w:p>
+            <w:pPr>
+              <w:spacing w:before="60" w:after="60"/>
+            </w:pPr>
             <w:r/>
             <w:r>
               <w:rPr>
@@ -2347,8 +2562,12 @@
         <w:tc>
           <w:tcPr>
             <w:tcW w:type="dxa" w:w="1584"/>
+            <w:vAlign w:val="center"/>
           </w:tcPr>
           <w:p>
+            <w:pPr>
+              <w:spacing w:before="60" w:after="60"/>
+            </w:pPr>
             <w:r/>
             <w:r>
               <w:rPr>
@@ -2361,8 +2580,12 @@
         <w:tc>
           <w:tcPr>
             <w:tcW w:type="dxa" w:w="1872"/>
+            <w:vAlign w:val="center"/>
           </w:tcPr>
           <w:p>
+            <w:pPr>
+              <w:spacing w:before="60" w:after="60"/>
+            </w:pPr>
             <w:r/>
             <w:r>
               <w:rPr>
@@ -2376,8 +2599,12 @@
         <w:tc>
           <w:tcPr>
             <w:tcW w:type="dxa" w:w="1872"/>
+            <w:vAlign w:val="center"/>
           </w:tcPr>
           <w:p>
+            <w:pPr>
+              <w:spacing w:before="60" w:after="60"/>
+            </w:pPr>
             <w:r/>
             <w:r>
               <w:rPr>
@@ -2391,8 +2618,12 @@
         <w:tc>
           <w:tcPr>
             <w:tcW w:type="dxa" w:w="1584"/>
+            <w:vAlign w:val="center"/>
           </w:tcPr>
           <w:p>
+            <w:pPr>
+              <w:spacing w:before="60" w:after="60"/>
+            </w:pPr>
             <w:r/>
             <w:r>
               <w:rPr>
@@ -2444,10 +2675,12 @@
         <w:tc>
           <w:tcPr>
             <w:tcW w:type="dxa" w:w="3744"/>
+            <w:vAlign w:val="center"/>
           </w:tcPr>
           <w:p>
             <w:pPr>
               <w:keepNext/>
+              <w:spacing w:before="60" w:after="60"/>
             </w:pPr>
             <w:r/>
             <w:r>
@@ -2462,10 +2695,12 @@
         <w:tc>
           <w:tcPr>
             <w:tcW w:type="dxa" w:w="6048"/>
+            <w:vAlign w:val="center"/>
           </w:tcPr>
           <w:p>
             <w:pPr>
               <w:keepNext/>
+              <w:spacing w:before="60" w:after="60"/>
             </w:pPr>
             <w:r/>
             <w:r>
@@ -2485,10 +2720,12 @@
         <w:tc>
           <w:tcPr>
             <w:tcW w:type="dxa" w:w="3744"/>
+            <w:vAlign w:val="center"/>
           </w:tcPr>
           <w:p>
             <w:pPr>
               <w:keepNext/>
+              <w:spacing w:before="60" w:after="60"/>
             </w:pPr>
             <w:r/>
             <w:r>
@@ -2502,10 +2739,12 @@
         <w:tc>
           <w:tcPr>
             <w:tcW w:type="dxa" w:w="6048"/>
+            <w:vAlign w:val="center"/>
           </w:tcPr>
           <w:p>
             <w:pPr>
               <w:keepNext/>
+              <w:spacing w:before="60" w:after="60"/>
             </w:pPr>
             <w:r/>
             <w:r>
@@ -2524,10 +2763,12 @@
         <w:tc>
           <w:tcPr>
             <w:tcW w:type="dxa" w:w="3744"/>
+            <w:vAlign w:val="center"/>
           </w:tcPr>
           <w:p>
             <w:pPr>
               <w:keepNext/>
+              <w:spacing w:before="60" w:after="60"/>
             </w:pPr>
             <w:r/>
             <w:r>
@@ -2541,10 +2782,12 @@
         <w:tc>
           <w:tcPr>
             <w:tcW w:type="dxa" w:w="6048"/>
+            <w:vAlign w:val="center"/>
           </w:tcPr>
           <w:p>
             <w:pPr>
               <w:keepNext/>
+              <w:spacing w:before="60" w:after="60"/>
             </w:pPr>
             <w:r/>
             <w:r>
@@ -2563,10 +2806,12 @@
         <w:tc>
           <w:tcPr>
             <w:tcW w:type="dxa" w:w="3744"/>
+            <w:vAlign w:val="center"/>
           </w:tcPr>
           <w:p>
             <w:pPr>
               <w:keepNext/>
+              <w:spacing w:before="60" w:after="60"/>
             </w:pPr>
             <w:r/>
             <w:r>
@@ -2580,10 +2825,12 @@
         <w:tc>
           <w:tcPr>
             <w:tcW w:type="dxa" w:w="6048"/>
+            <w:vAlign w:val="center"/>
           </w:tcPr>
           <w:p>
             <w:pPr>
               <w:keepNext/>
+              <w:spacing w:before="60" w:after="60"/>
             </w:pPr>
             <w:r/>
             <w:r>
@@ -2602,10 +2849,12 @@
         <w:tc>
           <w:tcPr>
             <w:tcW w:type="dxa" w:w="3744"/>
+            <w:vAlign w:val="center"/>
           </w:tcPr>
           <w:p>
             <w:pPr>
               <w:keepNext/>
+              <w:spacing w:before="60" w:after="60"/>
             </w:pPr>
             <w:r/>
             <w:r>
@@ -2619,10 +2868,12 @@
         <w:tc>
           <w:tcPr>
             <w:tcW w:type="dxa" w:w="6048"/>
+            <w:vAlign w:val="center"/>
           </w:tcPr>
           <w:p>
             <w:pPr>
               <w:keepNext/>
+              <w:spacing w:before="60" w:after="60"/>
             </w:pPr>
             <w:r/>
             <w:r>
@@ -2641,10 +2892,12 @@
         <w:tc>
           <w:tcPr>
             <w:tcW w:type="dxa" w:w="3744"/>
+            <w:vAlign w:val="center"/>
           </w:tcPr>
           <w:p>
             <w:pPr>
               <w:keepNext/>
+              <w:spacing w:before="60" w:after="60"/>
             </w:pPr>
             <w:r/>
             <w:r>
@@ -2658,10 +2911,12 @@
         <w:tc>
           <w:tcPr>
             <w:tcW w:type="dxa" w:w="6048"/>
+            <w:vAlign w:val="center"/>
           </w:tcPr>
           <w:p>
             <w:pPr>
               <w:keepNext/>
+              <w:spacing w:before="60" w:after="60"/>
             </w:pPr>
             <w:r/>
             <w:r>
@@ -2680,10 +2935,12 @@
         <w:tc>
           <w:tcPr>
             <w:tcW w:type="dxa" w:w="3744"/>
+            <w:vAlign w:val="center"/>
           </w:tcPr>
           <w:p>
             <w:pPr>
               <w:keepNext/>
+              <w:spacing w:before="60" w:after="60"/>
             </w:pPr>
             <w:r/>
             <w:r>
@@ -2697,10 +2954,12 @@
         <w:tc>
           <w:tcPr>
             <w:tcW w:type="dxa" w:w="6048"/>
+            <w:vAlign w:val="center"/>
           </w:tcPr>
           <w:p>
             <w:pPr>
               <w:keepNext/>
+              <w:spacing w:before="60" w:after="60"/>
             </w:pPr>
             <w:r/>
             <w:r>
@@ -2719,8 +2978,12 @@
         <w:tc>
           <w:tcPr>
             <w:tcW w:type="dxa" w:w="3744"/>
+            <w:vAlign w:val="center"/>
           </w:tcPr>
           <w:p>
+            <w:pPr>
+              <w:spacing w:before="60" w:after="60"/>
+            </w:pPr>
             <w:r/>
             <w:r>
               <w:rPr>
@@ -2733,8 +2996,12 @@
         <w:tc>
           <w:tcPr>
             <w:tcW w:type="dxa" w:w="6048"/>
+            <w:vAlign w:val="center"/>
           </w:tcPr>
           <w:p>
+            <w:pPr>
+              <w:spacing w:before="60" w:after="60"/>
+            </w:pPr>
             <w:r/>
             <w:r>
               <w:rPr>
@@ -2788,7 +3055,7 @@
                     <pic:cNvPicPr/>
                   </pic:nvPicPr>
                   <pic:blipFill>
-                    <a:blip r:embed="rId13"/>
+                    <a:blip r:embed="rId16"/>
                     <a:stretch>
                       <a:fillRect/>
                     </a:stretch>

</xml_diff>